<commit_message>
spec: 2026-06-04 — SEO public-surface specs (0018/0006/0022/0015) + 0000 wallet-drift cleanup (Cowork §A#1-4 done, §B#6-7 partial)
Applied the locked SEO & AI Discoverability Playbook (doc 17) to the iterations owning each public surface: 0018 § public /supplies browse tree (indexable, auth-gated cart) · 0006 § public vendor profile /v/[slug] (LocalBusiness) + 0022 § vendor authoring · 0015 § homepage featured fairs + public /fairs pages (Event JSON-LD). Schema/titles per Playbook §4.4/§5.1/§5.2/§11.2-11.3.1; .docx mirrors regenerated.

Wallet drift: 0000 launcher + Add-ons card + route table cleaned (wallet retired -> order-and-pay 0034); Connection Map 0003 row tombstoned RETIRED. Deeper spend()-prose reconciliation still owed (worklist §B#6/#7). DECISION_LOG + Cowork_Pending_Items updated.

Co-Authored-By: Claude Opus 4.8 <noreply@anthropic.com>
</commit_message>
<xml_diff>
--- a/0022_vendor_dashboard/0022_vendor_dashboard.docx
+++ b/0022_vendor_dashboard/0022_vendor_dashboard.docx
@@ -2,7 +2,7 @@
 <file path=word/document.xml><?xml version="1.0" encoding="utf-8"?>
 <w:document xmlns:w="http://schemas.openxmlformats.org/wordprocessingml/2006/main" xmlns:m="http://schemas.openxmlformats.org/officeDocument/2006/math" xmlns:r="http://schemas.openxmlformats.org/officeDocument/2006/relationships" xmlns:o="urn:schemas-microsoft-com:office:office" xmlns:v="urn:schemas-microsoft-com:vml" xmlns:w10="urn:schemas-microsoft-com:office:word" xmlns:a="http://schemas.openxmlformats.org/drawingml/2006/main" xmlns:pic="http://schemas.openxmlformats.org/drawingml/2006/picture" xmlns:wp="http://schemas.openxmlformats.org/drawingml/2006/wordprocessingDrawing">
   <w:body>
-    <w:bookmarkStart w:id="75" w:name="Xafe8a010b541a7ceb55337d04c0f7dc192e4d32"/>
+    <w:bookmarkStart w:id="76" w:name="Xafe8a010b541a7ceb55337d04c0f7dc192e4d32"/>
     <w:p>
       <w:pPr>
         <w:pStyle w:val="Heading1"/>
@@ -15297,13 +15297,87 @@
       </w:r>
     </w:p>
     <w:bookmarkEnd w:id="60"/>
-    <w:bookmarkStart w:id="61" w:name="cross-iteration-handoffs"/>
+    <w:bookmarkStart w:id="61" w:name="X7b2b41d44105dffbc4eecbdd7dbb41b194e286d"/>
     <w:p>
       <w:pPr>
         <w:pStyle w:val="Heading2"/>
       </w:pPr>
       <w:r>
-        <w:t xml:space="preserve">8. Cross-iteration handoffs</w:t>
+        <w:t xml:space="preserve">Public profile (vendor-controlled ·</w:t>
+      </w:r>
+      <w:r>
+        <w:t xml:space="preserve"> </w:t>
+      </w:r>
+      <w:r>
+        <w:rPr>
+          <w:rStyle w:val="VerbatimChar"/>
+        </w:rPr>
+        <w:t xml:space="preserve">/v/[slug]</w:t>
+      </w:r>
+      <w:r>
+        <w:t xml:space="preserve">) — added 2026-06-04</w:t>
+      </w:r>
+    </w:p>
+    <w:p>
+      <w:pPr>
+        <w:pStyle w:val="FirstParagraph"/>
+      </w:pPr>
+      <w:r>
+        <w:rPr>
+          <w:b/>
+          <w:bCs/>
+        </w:rPr>
+        <w:t xml:space="preserve">Locked (Cowork 2026-06-04 · resolves SEO-pending item #2, vendor side):</w:t>
+      </w:r>
+      <w:r>
+        <w:t xml:space="preserve"> </w:t>
+      </w:r>
+      <w:r>
+        <w:t xml:space="preserve">the vendor’s</w:t>
+      </w:r>
+      <w:r>
+        <w:t xml:space="preserve"> </w:t>
+      </w:r>
+      <w:r>
+        <w:rPr>
+          <w:b/>
+          <w:bCs/>
+        </w:rPr>
+        <w:t xml:space="preserve">public SEO profile</w:t>
+      </w:r>
+      <w:r>
+        <w:t xml:space="preserve"> </w:t>
+      </w:r>
+      <w:r>
+        <w:t xml:space="preserve">at</w:t>
+      </w:r>
+      <w:r>
+        <w:t xml:space="preserve"> </w:t>
+      </w:r>
+      <w:r>
+        <w:rPr>
+          <w:rStyle w:val="VerbatimChar"/>
+        </w:rPr>
+        <w:t xml:space="preserve">/v/[slug]</w:t>
+      </w:r>
+      <w:r>
+        <w:t xml:space="preserve"> </w:t>
+      </w:r>
+      <w:r>
+        <w:t xml:space="preserve">(spec’d in 0006 § Public vendor profile) is</w:t>
+      </w:r>
+      <w:r>
+        <w:t xml:space="preserve"> </w:t>
+      </w:r>
+      <w:r>
+        <w:rPr>
+          <w:b/>
+          <w:bCs/>
+        </w:rPr>
+        <w:t xml:space="preserve">authored and visibility-controlled from this dashboard</w:t>
+      </w:r>
+      <w:r>
+        <w:t xml:space="preserve">.</w:t>
       </w:r>
     </w:p>
     <w:p>
@@ -15315,17 +15389,7 @@
         </w:numPr>
       </w:pPr>
       <w:r>
-        <w:rPr>
-          <w:b/>
-          <w:bCs/>
-        </w:rPr>
-        <w:t xml:space="preserve">0006 Vendors</w:t>
-      </w:r>
-      <w:r>
-        <w:t xml:space="preserve"> </w:t>
-      </w:r>
-      <w:r>
-        <w:t xml:space="preserve">— extends the couple-side vendor profile with the vendor’s own authoring surface here.</w:t>
+        <w:t xml:space="preserve">Vendor edits the indexable fields here: public bio, services + packages, portfolio photos, coverage city/area, slug (URL &amp; Slug tab, 0025).</w:t>
       </w:r>
     </w:p>
     <w:p>
@@ -15337,32 +15401,7 @@
         </w:numPr>
       </w:pPr>
       <w:r>
-        <w:rPr>
-          <w:b/>
-          <w:bCs/>
-        </w:rPr>
-        <w:t xml:space="preserve">0019 Communications</w:t>
-      </w:r>
-      <w:r>
-        <w:t xml:space="preserve"> </w:t>
-      </w:r>
-      <w:r>
-        <w:t xml:space="preserve">— chat threads + file sharing + coordinator-join live there; this surface just renders them.</w:t>
-      </w:r>
-      <w:r>
-        <w:t xml:space="preserve"> </w:t>
-      </w:r>
-      <w:r>
-        <w:rPr>
-          <w:strike/>
-        </w:rPr>
-        <w:t xml:space="preserve">Video meetings</w:t>
-      </w:r>
-      <w:r>
-        <w:t xml:space="preserve"> </w:t>
-      </w:r>
-      <w:r>
-        <w:t xml:space="preserve">retired 2026-05-16 — external tools (Google Meet / Zoom / Messenger / WhatsApp) used instead.</w:t>
+        <w:t xml:space="preserve">Profile-completeness nudge surfaces in Home (a thin/empty profile won’t rank — Playbook §5.3 depth minimums).</w:t>
       </w:r>
     </w:p>
     <w:p>
@@ -15374,17 +15413,7 @@
         </w:numPr>
       </w:pPr>
       <w:r>
-        <w:rPr>
-          <w:b/>
-          <w:bCs/>
-        </w:rPr>
-        <w:t xml:space="preserve">0007 Budget</w:t>
-      </w:r>
-      <w:r>
-        <w:t xml:space="preserve"> </w:t>
-      </w:r>
-      <w:r>
-        <w:t xml:space="preserve">— when a client pays the vendor, the milestone flows back into the couple’s budget; vendor sees their own payment register here.</w:t>
+        <w:t xml:space="preserve">Visibility tier (Free/Verified name-masking → reveals on first chat reply; Pro+ always visible) governs what the public profile exposes — see the vendor hybrid-anonymity lock + 0006.</w:t>
       </w:r>
     </w:p>
     <w:p>
@@ -15396,17 +15425,17 @@
         </w:numPr>
       </w:pPr>
       <w:r>
-        <w:rPr>
-          <w:b/>
-          <w:bCs/>
-        </w:rPr>
-        <w:t xml:space="preserve">0020 Interaction Prototype</w:t>
-      </w:r>
-      <w:r>
-        <w:t xml:space="preserve"> </w:t>
-      </w:r>
-      <w:r>
-        <w:t xml:space="preserve">— Phase 1 covers vendor onboarding (0022 expands the post-verification view).</w:t>
+        <w:t xml:space="preserve">Schema + title/meta + indexability are the 0006/Playbook §4.4/§5.2 responsibility; this surface only authors the content.</w:t>
+      </w:r>
+    </w:p>
+    <w:bookmarkEnd w:id="61"/>
+    <w:bookmarkStart w:id="62" w:name="cross-iteration-handoffs"/>
+    <w:p>
+      <w:pPr>
+        <w:pStyle w:val="Heading2"/>
+      </w:pPr>
+      <w:r>
+        <w:t xml:space="preserve">8. Cross-iteration handoffs</w:t>
       </w:r>
     </w:p>
     <w:p>
@@ -15414,7 +15443,110 @@
         <w:pStyle w:val="Compact"/>
         <w:numPr>
           <w:ilvl w:val="0"/>
-          <w:numId w:val="1030"/>
+          <w:numId w:val="1031"/>
+        </w:numPr>
+      </w:pPr>
+      <w:r>
+        <w:rPr>
+          <w:b/>
+          <w:bCs/>
+        </w:rPr>
+        <w:t xml:space="preserve">0006 Vendors</w:t>
+      </w:r>
+      <w:r>
+        <w:t xml:space="preserve"> </w:t>
+      </w:r>
+      <w:r>
+        <w:t xml:space="preserve">— extends the couple-side vendor profile with the vendor’s own authoring surface here.</w:t>
+      </w:r>
+    </w:p>
+    <w:p>
+      <w:pPr>
+        <w:pStyle w:val="Compact"/>
+        <w:numPr>
+          <w:ilvl w:val="0"/>
+          <w:numId w:val="1031"/>
+        </w:numPr>
+      </w:pPr>
+      <w:r>
+        <w:rPr>
+          <w:b/>
+          <w:bCs/>
+        </w:rPr>
+        <w:t xml:space="preserve">0019 Communications</w:t>
+      </w:r>
+      <w:r>
+        <w:t xml:space="preserve"> </w:t>
+      </w:r>
+      <w:r>
+        <w:t xml:space="preserve">— chat threads + file sharing + coordinator-join live there; this surface just renders them.</w:t>
+      </w:r>
+      <w:r>
+        <w:t xml:space="preserve"> </w:t>
+      </w:r>
+      <w:r>
+        <w:rPr>
+          <w:strike/>
+        </w:rPr>
+        <w:t xml:space="preserve">Video meetings</w:t>
+      </w:r>
+      <w:r>
+        <w:t xml:space="preserve"> </w:t>
+      </w:r>
+      <w:r>
+        <w:t xml:space="preserve">retired 2026-05-16 — external tools (Google Meet / Zoom / Messenger / WhatsApp) used instead.</w:t>
+      </w:r>
+    </w:p>
+    <w:p>
+      <w:pPr>
+        <w:pStyle w:val="Compact"/>
+        <w:numPr>
+          <w:ilvl w:val="0"/>
+          <w:numId w:val="1031"/>
+        </w:numPr>
+      </w:pPr>
+      <w:r>
+        <w:rPr>
+          <w:b/>
+          <w:bCs/>
+        </w:rPr>
+        <w:t xml:space="preserve">0007 Budget</w:t>
+      </w:r>
+      <w:r>
+        <w:t xml:space="preserve"> </w:t>
+      </w:r>
+      <w:r>
+        <w:t xml:space="preserve">— when a client pays the vendor, the milestone flows back into the couple’s budget; vendor sees their own payment register here.</w:t>
+      </w:r>
+    </w:p>
+    <w:p>
+      <w:pPr>
+        <w:pStyle w:val="Compact"/>
+        <w:numPr>
+          <w:ilvl w:val="0"/>
+          <w:numId w:val="1031"/>
+        </w:numPr>
+      </w:pPr>
+      <w:r>
+        <w:rPr>
+          <w:b/>
+          <w:bCs/>
+        </w:rPr>
+        <w:t xml:space="preserve">0020 Interaction Prototype</w:t>
+      </w:r>
+      <w:r>
+        <w:t xml:space="preserve"> </w:t>
+      </w:r>
+      <w:r>
+        <w:t xml:space="preserve">— Phase 1 covers vendor onboarding (0022 expands the post-verification view).</w:t>
+      </w:r>
+    </w:p>
+    <w:p>
+      <w:pPr>
+        <w:pStyle w:val="Compact"/>
+        <w:numPr>
+          <w:ilvl w:val="0"/>
+          <w:numId w:val="1031"/>
         </w:numPr>
       </w:pPr>
       <w:r>
@@ -15438,8 +15570,8 @@
         </w:pict>
       </w:r>
     </w:p>
-    <w:bookmarkEnd w:id="61"/>
-    <w:bookmarkStart w:id="62" w:name="Xd4881637e7acba4a4ba0743ec8ee3c62da9c61c"/>
+    <w:bookmarkEnd w:id="62"/>
+    <w:bookmarkStart w:id="63" w:name="Xd4881637e7acba4a4ba0743ec8ee3c62da9c61c"/>
     <w:p>
       <w:pPr>
         <w:pStyle w:val="Heading2"/>
@@ -15992,8 +16124,8 @@
         </w:pict>
       </w:r>
     </w:p>
-    <w:bookmarkEnd w:id="62"/>
-    <w:bookmarkStart w:id="73" w:name="Xf8496184cc3da5533cc9c53e28eafe5ce2d77ec"/>
+    <w:bookmarkEnd w:id="63"/>
+    <w:bookmarkStart w:id="74" w:name="Xf8496184cc3da5533cc9c53e28eafe5ce2d77ec"/>
     <w:p>
       <w:pPr>
         <w:pStyle w:val="Heading2"/>
@@ -16019,7 +16151,7 @@
         <w:t xml:space="preserve">). Vendors hold per-service Specialized Pro Tools subscriptions / render-pack credits on top of their universal Free / Pro / Max vendor tier (§ 3). The two tier systems are independent — a Free Vendor can subscribe to Professional Mood Board; a Pro Vendor can stay on Free Mood Board.</w:t>
       </w:r>
     </w:p>
-    <w:bookmarkStart w:id="63" w:name="pro-tools-surface-in-vendor-dashboard"/>
+    <w:bookmarkStart w:id="64" w:name="pro-tools-surface-in-vendor-dashboard"/>
     <w:p>
       <w:pPr>
         <w:pStyle w:val="Heading3"/>
@@ -16187,8 +16319,8 @@
         </w:tc>
       </w:tr>
     </w:tbl>
-    <w:bookmarkEnd w:id="63"/>
-    <w:bookmarkStart w:id="68" w:name="X0f5563068e15eede94caf427dadf7009cc6ae86"/>
+    <w:bookmarkEnd w:id="64"/>
+    <w:bookmarkStart w:id="69" w:name="X0f5563068e15eede94caf427dadf7009cc6ae86"/>
     <w:p>
       <w:pPr>
         <w:pStyle w:val="Heading3"/>
@@ -16207,7 +16339,7 @@
       <w:r>
         <w:t xml:space="preserve"> </w:t>
       </w:r>
-      <w:hyperlink r:id="rId64">
+      <w:hyperlink r:id="rId65">
         <w:r>
           <w:rPr>
             <w:rStyle w:val="Hyperlink"/>
@@ -16224,7 +16356,7 @@
         <w:pStyle w:val="Compact"/>
         <w:numPr>
           <w:ilvl w:val="0"/>
-          <w:numId w:val="1031"/>
+          <w:numId w:val="1032"/>
         </w:numPr>
       </w:pPr>
       <w:r>
@@ -16255,7 +16387,7 @@
         <w:pStyle w:val="Compact"/>
         <w:numPr>
           <w:ilvl w:val="0"/>
-          <w:numId w:val="1031"/>
+          <w:numId w:val="1032"/>
         </w:numPr>
       </w:pPr>
       <w:r>
@@ -16274,7 +16406,7 @@
       <w:r>
         <w:t xml:space="preserve"> </w:t>
       </w:r>
-      <w:hyperlink r:id="rId65">
+      <w:hyperlink r:id="rId66">
         <w:r>
           <w:rPr>
             <w:rStyle w:val="Hyperlink"/>
@@ -16294,7 +16426,7 @@
         <w:pStyle w:val="Compact"/>
         <w:numPr>
           <w:ilvl w:val="0"/>
-          <w:numId w:val="1031"/>
+          <w:numId w:val="1032"/>
         </w:numPr>
       </w:pPr>
       <w:r>
@@ -16316,7 +16448,7 @@
         <w:pStyle w:val="Compact"/>
         <w:numPr>
           <w:ilvl w:val="0"/>
-          <w:numId w:val="1031"/>
+          <w:numId w:val="1032"/>
         </w:numPr>
       </w:pPr>
       <w:r>
@@ -16335,7 +16467,7 @@
       <w:r>
         <w:t xml:space="preserve"> </w:t>
       </w:r>
-      <w:hyperlink r:id="rId66">
+      <w:hyperlink r:id="rId67">
         <w:r>
           <w:rPr>
             <w:rStyle w:val="Hyperlink"/>
@@ -16357,7 +16489,7 @@
       <w:r>
         <w:t xml:space="preserve"> </w:t>
       </w:r>
-      <w:hyperlink r:id="rId67">
+      <w:hyperlink r:id="rId68">
         <w:r>
           <w:rPr>
             <w:rStyle w:val="Hyperlink"/>
@@ -16384,8 +16516,8 @@
         <w:t xml:space="preserve">badge on the stylist’s card — signals to couples that this stylist can generate AI-composited scene visualizations of their wedding (per host access pattern from the 2026-05-22 lock — hosts reach renders by hiring a stylist who holds Mood Board credits).</w:t>
       </w:r>
     </w:p>
-    <w:bookmarkEnd w:id="68"/>
-    <w:bookmarkStart w:id="70" w:name="Xb73185af4a5b9c4edc2296f9ca6509a210167dc"/>
+    <w:bookmarkEnd w:id="69"/>
+    <w:bookmarkStart w:id="71" w:name="Xb73185af4a5b9c4edc2296f9ca6509a210167dc"/>
     <w:p>
       <w:pPr>
         <w:pStyle w:val="Heading3"/>
@@ -17146,7 +17278,7 @@
       <w:r>
         <w:t xml:space="preserve"> </w:t>
       </w:r>
-      <w:hyperlink r:id="rId69">
+      <w:hyperlink r:id="rId70">
         <w:r>
           <w:rPr>
             <w:rStyle w:val="Hyperlink"/>
@@ -17170,8 +17302,8 @@
         <w:t xml:space="preserve">in the pricing sheet. Final pricing TBD per SKU — pure-code SKUs likely settle in ₱499-₱999/wk range, AI SKUs in ₱1,999-₱2,999/wk range with bundled allowance + overage packs.</w:t>
       </w:r>
     </w:p>
-    <w:bookmarkEnd w:id="70"/>
-    <w:bookmarkStart w:id="72" w:name="engineering-pending"/>
+    <w:bookmarkEnd w:id="71"/>
+    <w:bookmarkStart w:id="73" w:name="engineering-pending"/>
     <w:p>
       <w:pPr>
         <w:pStyle w:val="Heading3"/>
@@ -17185,7 +17317,7 @@
         <w:pStyle w:val="Compact"/>
         <w:numPr>
           <w:ilvl w:val="0"/>
-          <w:numId w:val="1032"/>
+          <w:numId w:val="1033"/>
         </w:numPr>
       </w:pPr>
       <w:r>
@@ -17209,7 +17341,7 @@
         <w:pStyle w:val="Compact"/>
         <w:numPr>
           <w:ilvl w:val="0"/>
-          <w:numId w:val="1032"/>
+          <w:numId w:val="1033"/>
         </w:numPr>
       </w:pPr>
       <w:r>
@@ -17236,7 +17368,7 @@
         <w:pStyle w:val="Compact"/>
         <w:numPr>
           <w:ilvl w:val="0"/>
-          <w:numId w:val="1032"/>
+          <w:numId w:val="1033"/>
         </w:numPr>
       </w:pPr>
       <w:r>
@@ -17245,7 +17377,7 @@
       <w:r>
         <w:t xml:space="preserve"> </w:t>
       </w:r>
-      <w:hyperlink r:id="rId65">
+      <w:hyperlink r:id="rId66">
         <w:r>
           <w:rPr>
             <w:rStyle w:val="Hyperlink"/>
@@ -17259,7 +17391,7 @@
         <w:pStyle w:val="Compact"/>
         <w:numPr>
           <w:ilvl w:val="0"/>
-          <w:numId w:val="1032"/>
+          <w:numId w:val="1033"/>
         </w:numPr>
       </w:pPr>
       <w:r>
@@ -17271,7 +17403,7 @@
         <w:pStyle w:val="Compact"/>
         <w:numPr>
           <w:ilvl w:val="0"/>
-          <w:numId w:val="1032"/>
+          <w:numId w:val="1033"/>
         </w:numPr>
       </w:pPr>
       <w:r>
@@ -17300,7 +17432,7 @@
       <w:r>
         <w:t xml:space="preserve"> </w:t>
       </w:r>
-      <w:hyperlink r:id="rId71">
+      <w:hyperlink r:id="rId72">
         <w:r>
           <w:rPr>
             <w:rStyle w:val="Hyperlink"/>
@@ -17319,9 +17451,9 @@
         </w:pict>
       </w:r>
     </w:p>
-    <w:bookmarkEnd w:id="72"/>
     <w:bookmarkEnd w:id="73"/>
-    <w:bookmarkStart w:id="74" w:name="companions-and-next-steps"/>
+    <w:bookmarkEnd w:id="74"/>
+    <w:bookmarkStart w:id="75" w:name="companions-and-next-steps"/>
     <w:p>
       <w:pPr>
         <w:pStyle w:val="Heading2"/>
@@ -17335,7 +17467,7 @@
         <w:pStyle w:val="Compact"/>
         <w:numPr>
           <w:ilvl w:val="0"/>
-          <w:numId w:val="1033"/>
+          <w:numId w:val="1034"/>
         </w:numPr>
       </w:pPr>
       <w:r>
@@ -17356,7 +17488,7 @@
         <w:pStyle w:val="Compact"/>
         <w:numPr>
           <w:ilvl w:val="0"/>
-          <w:numId w:val="1033"/>
+          <w:numId w:val="1034"/>
         </w:numPr>
       </w:pPr>
       <w:r>
@@ -17377,7 +17509,7 @@
         <w:pStyle w:val="Compact"/>
         <w:numPr>
           <w:ilvl w:val="0"/>
-          <w:numId w:val="1033"/>
+          <w:numId w:val="1034"/>
         </w:numPr>
       </w:pPr>
       <w:r>
@@ -17405,7 +17537,7 @@
         <w:pStyle w:val="Compact"/>
         <w:numPr>
           <w:ilvl w:val="0"/>
-          <w:numId w:val="1033"/>
+          <w:numId w:val="1034"/>
         </w:numPr>
       </w:pPr>
       <w:r>
@@ -17428,8 +17560,8 @@
         <w:t xml:space="preserve">(drafted) — Save-the-Date Maker — 30 head-turning templates, customer uploads 3-8 video clips, render in 3 formats, ₱49 per render.</w:t>
       </w:r>
     </w:p>
-    <w:bookmarkEnd w:id="74"/>
     <w:bookmarkEnd w:id="75"/>
+    <w:bookmarkEnd w:id="76"/>
     <w:sectPr>
       <w:footnotePr>
         <w:numRestart w:val="eachSect"/>
@@ -17990,6 +18122,9 @@
     <w:abstractNumId w:val="991"/>
   </w:num>
   <w:num w:numId="1033">
+    <w:abstractNumId w:val="991"/>
+  </w:num>
+  <w:num w:numId="1034">
     <w:abstractNumId w:val="991"/>
   </w:num>
 </w:numbering>

</xml_diff>